<commit_message>
Folio final: roles, Team screen, sandbox, settings, submission folder, docs; remove legacy MOTIF files
Co-Authored-By: Claude Sonnet 5.5 <noreply@anthropic.com>
Claude-Session: https://claude.ai/code/session_01Fr7KHTkupJUiaF5WVwZjVq
</commit_message>
<xml_diff>
--- a/docs/team/team-charter.docx
+++ b/docs/team/team-charter.docx
@@ -930,7 +930,7 @@
           <w:sz w:val="24"/>
           <w:szCs w:val="24"/>
         </w:rPr>
-        <w:t xml:space="preserve">2.3 Mohammad Shahzad</w:t>
+        <w:t>2.3 Shaz Shahzad</w:t>
       </w:r>
     </w:p>
     <w:tbl>
@@ -993,7 +993,7 @@
                 <w:sz w:val="20"/>
                 <w:szCs w:val="20"/>
               </w:rPr>
-              <w:t xml:space="preserve">Mohammad Shahzad</w:t>
+              <w:t>Shaz Shahzad</w:t>
             </w:r>
           </w:p>
         </w:tc>
@@ -2162,7 +2162,7 @@
           <w:sz w:val="21"/>
           <w:szCs w:val="21"/>
         </w:rPr>
-        <w:t xml:space="preserve">Mohammad Shahzad     </w:t>
+        <w:t xml:space="preserve">Shaz Shahzad     </w:t>
       </w:r>
       <w:r>
         <w:rPr>

</xml_diff>